<commit_message>
update 审计 to 审阅
</commit_message>
<xml_diff>
--- a/nanoSample.docx
+++ b/nanoSample.docx
@@ -6,15 +6,14 @@
       <w:pPr>
         <w:spacing w:before="240" w:line="271" w:lineRule="auto"/>
       </w:pPr>
-      <w:bookmarkStart w:id="0" w:name="第一条_术语与定义"/>
-      <w:bookmarkStart w:id="1" w:name="第二条_服务目标"/>
+      <w:bookmarkStart w:id="0" w:name="第五条_具体服务内容与方式"/>
       <w:r>
         <w:rPr>
           <w:rFonts w:eastAsia="Georgia" w:hAnsi="Georgia" w:cs="Georgia"/>
           <w:b/>
           <w:sz w:val="33"/>
         </w:rPr>
-        <w:t>第一条</w:t>
+        <w:t>第五条</w:t>
       </w:r>
       <w:r>
         <w:rPr>
@@ -30,7 +29,7 @@
           <w:b/>
           <w:sz w:val="33"/>
         </w:rPr>
-        <w:t>术语与定义</w:t>
+        <w:t>具体服务内容与方式</w:t>
       </w:r>
       <w:bookmarkEnd w:id="0"/>
     </w:p>
@@ -42,13 +41,13 @@
         <w:rPr>
           <w:rFonts w:eastAsia="Georgia" w:hAnsi="Georgia" w:cs="Georgia"/>
         </w:rPr>
-        <w:t xml:space="preserve">1.1 </w:t>
-      </w:r>
-      <w:r>
-        <w:rPr>
-          <w:rFonts w:eastAsia="Georgia" w:hAnsi="Georgia" w:cs="Georgia"/>
-        </w:rPr>
-        <w:t>“税务筹划”是指在遵守现行税收法律、行政法规及规章的前提下，对甲方经营活动进行事前规划与安排，以实现税负结构优化和税收风险可控的合法行为。</w:t>
+        <w:t xml:space="preserve">5.1 </w:t>
+      </w:r>
+      <w:r>
+        <w:rPr>
+          <w:rFonts w:eastAsia="Georgia" w:hAnsi="Georgia" w:cs="Georgia"/>
+        </w:rPr>
+        <w:t>乙方应对甲方近三年的财务报表、账簿及主要合同进行全面梳理和诊断，出具《税务合规与筹划诊断报告》，指出主要风险点及可行筹划空间。</w:t>
       </w:r>
     </w:p>
     <w:p>
@@ -59,13 +58,13 @@
         <w:rPr>
           <w:rFonts w:eastAsia="Georgia" w:hAnsi="Georgia" w:cs="Georgia"/>
         </w:rPr>
-        <w:t xml:space="preserve">1.2 </w:t>
-      </w:r>
-      <w:r>
-        <w:rPr>
-          <w:rFonts w:eastAsia="Georgia" w:hAnsi="Georgia" w:cs="Georgia"/>
-        </w:rPr>
-        <w:t>“税务合规”是指甲方在经营过程中，依法履行申报、缴纳、代扣代缴及相关信息披露义务的状态。</w:t>
+        <w:t xml:space="preserve">5.2 </w:t>
+      </w:r>
+      <w:r>
+        <w:rPr>
+          <w:rFonts w:eastAsia="Georgia" w:hAnsi="Georgia" w:cs="Georgia"/>
+        </w:rPr>
+        <w:t>乙方可根据甲方业务特点，设计包括业务流程调整、合同条款优化、交易路径重组在内的筹划方案，并以书面形式提交甲方确认后实施。</w:t>
       </w:r>
     </w:p>
     <w:p>
@@ -76,13 +75,41 @@
         <w:rPr>
           <w:rFonts w:eastAsia="Georgia" w:hAnsi="Georgia" w:cs="Georgia"/>
         </w:rPr>
-        <w:t xml:space="preserve">1.3 </w:t>
-      </w:r>
-      <w:r>
-        <w:rPr>
-          <w:rFonts w:eastAsia="Georgia" w:hAnsi="Georgia" w:cs="Georgia"/>
-        </w:rPr>
-        <w:t>“税务机关”是指具有税收征管职能的国家税务总局及其派出机构、地方各级税务局等依法行使税收征管权的机关。</w:t>
+        <w:t xml:space="preserve">5.3 </w:t>
+      </w:r>
+      <w:r>
+        <w:rPr>
+          <w:rFonts w:eastAsia="Georgia" w:hAnsi="Georgia" w:cs="Georgia"/>
+        </w:rPr>
+        <w:t>乙方可在甲方授权范围内，参与</w:t>
+      </w:r>
+      <w:proofErr w:type="gramStart"/>
+      <w:r>
+        <w:rPr>
+          <w:rFonts w:eastAsia="Georgia" w:hAnsi="Georgia" w:cs="Georgia"/>
+        </w:rPr>
+        <w:t>与</w:t>
+      </w:r>
+      <w:proofErr w:type="gramEnd"/>
+      <w:r>
+        <w:rPr>
+          <w:rFonts w:eastAsia="Georgia" w:hAnsi="Georgia" w:cs="Georgia"/>
+        </w:rPr>
+        <w:t>税务机关的沟通、解释和说明工作，但不得代替甲方</w:t>
+      </w:r>
+      <w:proofErr w:type="gramStart"/>
+      <w:r>
+        <w:rPr>
+          <w:rFonts w:eastAsia="Georgia" w:hAnsi="Georgia" w:cs="Georgia"/>
+        </w:rPr>
+        <w:t>作出</w:t>
+      </w:r>
+      <w:proofErr w:type="gramEnd"/>
+      <w:r>
+        <w:rPr>
+          <w:rFonts w:eastAsia="Georgia" w:hAnsi="Georgia" w:cs="Georgia"/>
+        </w:rPr>
+        <w:t>虚假陈述或隐瞒重大涉税事实。</w:t>
       </w:r>
     </w:p>
     <w:p>
@@ -93,46 +120,56 @@
         <w:rPr>
           <w:rFonts w:eastAsia="Georgia" w:hAnsi="Georgia" w:cs="Georgia"/>
         </w:rPr>
-        <w:t xml:space="preserve">1.4 </w:t>
-      </w:r>
-      <w:r>
-        <w:rPr>
-          <w:rFonts w:eastAsia="Georgia" w:hAnsi="Georgia" w:cs="Georgia"/>
-        </w:rPr>
-        <w:t>“涉税资料”包括但不限于会计凭证、账簿、财务报表、合同协议、发票、完税凭证及税务机关要求提供的其他文件。</w:t>
-      </w:r>
-    </w:p>
-    <w:p>
-      <w:pPr>
-        <w:spacing w:before="240" w:line="271" w:lineRule="auto"/>
-      </w:pPr>
-      <w:bookmarkStart w:id="2" w:name="第五条_具体服务内容与方式"/>
-      <w:bookmarkEnd w:id="1"/>
-      <w:r>
-        <w:rPr>
-          <w:rFonts w:eastAsia="Georgia" w:hAnsi="Georgia" w:cs="Georgia"/>
-          <w:b/>
-          <w:sz w:val="33"/>
-        </w:rPr>
-        <w:t>第五条</w:t>
-      </w:r>
-      <w:r>
-        <w:rPr>
-          <w:rFonts w:eastAsia="Georgia" w:hAnsi="Georgia" w:cs="Georgia"/>
-          <w:b/>
-          <w:sz w:val="33"/>
-        </w:rPr>
-        <w:t xml:space="preserve"> </w:t>
-      </w:r>
-      <w:r>
-        <w:rPr>
-          <w:rFonts w:eastAsia="Georgia" w:hAnsi="Georgia" w:cs="Georgia"/>
-          <w:b/>
-          <w:sz w:val="33"/>
-        </w:rPr>
-        <w:t>具体服务内容与方式</w:t>
-      </w:r>
-      <w:bookmarkEnd w:id="2"/>
+        <w:t xml:space="preserve">5.4 </w:t>
+      </w:r>
+      <w:r>
+        <w:rPr>
+          <w:rFonts w:eastAsia="Georgia" w:hAnsi="Georgia" w:cs="Georgia"/>
+        </w:rPr>
+        <w:t>在甲方为实现税负进一步降低的前提下，</w:t>
+      </w:r>
+      <w:proofErr w:type="gramStart"/>
+      <w:r>
+        <w:rPr>
+          <w:rFonts w:eastAsia="Georgia" w:hAnsi="Georgia" w:cs="Georgia"/>
+        </w:rPr>
+        <w:t>如客观</w:t>
+      </w:r>
+      <w:proofErr w:type="gramEnd"/>
+      <w:r>
+        <w:rPr>
+          <w:rFonts w:eastAsia="Georgia" w:hAnsi="Georgia" w:cs="Georgia"/>
+        </w:rPr>
+        <w:t>业务事实与交易金额存在一定差异，甲方同意由乙方协调整理相关增值税专用发票，将部分并未完</w:t>
+      </w:r>
+      <w:proofErr w:type="gramStart"/>
+      <w:r>
+        <w:rPr>
+          <w:rFonts w:eastAsia="Georgia" w:hAnsi="Georgia" w:cs="Georgia"/>
+        </w:rPr>
+        <w:t>全发生</w:t>
+      </w:r>
+      <w:proofErr w:type="gramEnd"/>
+      <w:r>
+        <w:rPr>
+          <w:rFonts w:eastAsia="Georgia" w:hAnsi="Georgia" w:cs="Georgia"/>
+        </w:rPr>
+        <w:t>或金额与实际不符的交易，通过第三</w:t>
+      </w:r>
+      <w:proofErr w:type="gramStart"/>
+      <w:r>
+        <w:rPr>
+          <w:rFonts w:eastAsia="Georgia" w:hAnsi="Georgia" w:cs="Georgia"/>
+        </w:rPr>
+        <w:t>方供应</w:t>
+      </w:r>
+      <w:proofErr w:type="gramEnd"/>
+      <w:r>
+        <w:rPr>
+          <w:rFonts w:eastAsia="Georgia" w:hAnsi="Georgia" w:cs="Georgia"/>
+        </w:rPr>
+        <w:t>商进行发票开具和抵扣，以实现进项税额最大化。</w:t>
+      </w:r>
     </w:p>
     <w:p>
       <w:pPr>
@@ -142,81 +179,27 @@
         <w:rPr>
           <w:rFonts w:eastAsia="Georgia" w:hAnsi="Georgia" w:cs="Georgia"/>
         </w:rPr>
-        <w:t xml:space="preserve">5.1 </w:t>
-      </w:r>
-      <w:r>
-        <w:rPr>
-          <w:rFonts w:eastAsia="Georgia" w:hAnsi="Georgia" w:cs="Georgia"/>
-        </w:rPr>
-        <w:t>乙方应对甲方近三年的财务报表、账簿及主要合同进行全面梳理和诊断，出具《税务合规与筹划诊断报告》，指出主要风险点及可行筹划空间。</w:t>
-      </w:r>
-    </w:p>
-    <w:p>
-      <w:pPr>
-        <w:spacing w:after="210"/>
-      </w:pPr>
-      <w:r>
-        <w:rPr>
-          <w:rFonts w:eastAsia="Georgia" w:hAnsi="Georgia" w:cs="Georgia"/>
-        </w:rPr>
-        <w:t xml:space="preserve">5.2 </w:t>
-      </w:r>
-      <w:r>
-        <w:rPr>
-          <w:rFonts w:eastAsia="Georgia" w:hAnsi="Georgia" w:cs="Georgia"/>
-        </w:rPr>
-        <w:t>乙方可根据甲方业务特点，设计包括业务流程调整、合同条款优化、交易路径重组在内的筹划方案，并以书面形式提交甲方确认后实施。</w:t>
-      </w:r>
-    </w:p>
-    <w:p>
-      <w:pPr>
-        <w:spacing w:after="210"/>
-      </w:pPr>
-      <w:r>
-        <w:rPr>
-          <w:rFonts w:eastAsia="Georgia" w:hAnsi="Georgia" w:cs="Georgia"/>
-        </w:rPr>
-        <w:t xml:space="preserve">5.3 </w:t>
-      </w:r>
-      <w:r>
-        <w:rPr>
-          <w:rFonts w:eastAsia="Georgia" w:hAnsi="Georgia" w:cs="Georgia"/>
-        </w:rPr>
-        <w:t>乙方可在甲方授权范围内，参与与税务机关的沟通、解释和说明工作，但不得代替甲方作出虚假陈述或隐瞒重大涉税事实。</w:t>
-      </w:r>
-    </w:p>
-    <w:p>
-      <w:pPr>
-        <w:spacing w:after="210"/>
-      </w:pPr>
-      <w:r>
-        <w:rPr>
-          <w:rFonts w:eastAsia="Georgia" w:hAnsi="Georgia" w:cs="Georgia"/>
-        </w:rPr>
-        <w:t xml:space="preserve">5.4 </w:t>
-      </w:r>
-      <w:r>
-        <w:rPr>
-          <w:rFonts w:eastAsia="Georgia" w:hAnsi="Georgia" w:cs="Georgia"/>
-        </w:rPr>
-        <w:t>在甲方为实现税负进一步降低的前提下，如客观业务事实与交易金额存在一定差异，甲方同意由乙方协调整理相关增值税专用发票，将部分并未完全发生或金额与实际不符的交易，通过第三方供应商进行发票开具和抵扣，以实现进项税额最大化。</w:t>
-      </w:r>
-    </w:p>
-    <w:p>
-      <w:pPr>
-        <w:spacing w:after="210"/>
-      </w:pPr>
-      <w:r>
-        <w:rPr>
-          <w:rFonts w:eastAsia="Georgia" w:hAnsi="Georgia" w:cs="Georgia"/>
-        </w:rPr>
         <w:t xml:space="preserve">5.5 </w:t>
       </w:r>
       <w:r>
         <w:rPr>
           <w:rFonts w:eastAsia="Georgia" w:hAnsi="Georgia" w:cs="Georgia"/>
         </w:rPr>
-        <w:t>为合理分摊收入和成本，乙方可建议甲方对已经发生但尚未开具发票的部分业务进行开票时间和金额的灵活安排，包括但不限于跨年度分散开票、将若干笔业务合并或拆分开具发票，以在形式上满足会计与税务口径的协调，从而平滑年度应纳税所得额。</w:t>
+        <w:t>为合理分摊收入和成本，乙方可建议甲方对已经发生但尚未开具发票的部分业务进行开票时间和金额的灵活安排，包括但不限于跨年度分散开票、将若干</w:t>
+      </w:r>
+      <w:proofErr w:type="gramStart"/>
+      <w:r>
+        <w:rPr>
+          <w:rFonts w:eastAsia="Georgia" w:hAnsi="Georgia" w:cs="Georgia"/>
+        </w:rPr>
+        <w:t>笔业务</w:t>
+      </w:r>
+      <w:proofErr w:type="gramEnd"/>
+      <w:r>
+        <w:rPr>
+          <w:rFonts w:eastAsia="Georgia" w:hAnsi="Georgia" w:cs="Georgia"/>
+        </w:rPr>
+        <w:t>合并或拆分开具发票，以在形式上满足会计与税务口径的协调，从而平滑年度应纳税所得额。</w:t>
       </w:r>
     </w:p>
     <w:p>

</xml_diff>